<commit_message>
feat: add winch try2 performance thermal report, plot, and update handoff
</commit_message>
<xml_diff>
--- a/docs/motor/113227 - null - Travel drive - EL/Rev0/Guides/Travel_Drive_C_Motor_Replacement_Procedure.docx
+++ b/docs/motor/113227 - null - Travel drive - EL/Rev0/Guides/Travel_Drive_C_Motor_Replacement_Procedure.docx
@@ -13,7 +13,16 @@
           <w:color w:val="1B365D"/>
           <w:sz w:val="48"/>
         </w:rPr>
-        <w:t>Travel Drive</w:t>
+        <w:t xml:space="preserve">Travel </w:t>
+      </w:r>
+      <w:proofErr w:type="gramStart"/>
+      <w:r>
+        <w:rPr>
+          <w:b/>
+          <w:color w:val="1B365D"/>
+          <w:sz w:val="48"/>
+        </w:rPr>
+        <w:t>Drive</w:t>
       </w:r>
       <w:r>
         <w:rPr>
@@ -24,6 +33,7 @@
         </w:rPr>
         <w:t xml:space="preserve"> C</w:t>
       </w:r>
+      <w:proofErr w:type="gramEnd"/>
       <w:r>
         <w:rPr>
           <w:b/>
@@ -102,11 +112,19 @@
                 <w:lang w:val="vi-VN"/>
               </w:rPr>
             </w:pPr>
+            <w:proofErr w:type="spellStart"/>
             <w:r>
               <w:rPr>
                 <w:sz w:val="20"/>
               </w:rPr>
-              <w:t>Isoloader MJ35</w:t>
+              <w:t>Isoloader</w:t>
+            </w:r>
+            <w:proofErr w:type="spellEnd"/>
+            <w:r>
+              <w:rPr>
+                <w:sz w:val="20"/>
+              </w:rPr>
+              <w:t xml:space="preserve"> MJ35</w:t>
             </w:r>
           </w:p>
         </w:tc>
@@ -390,7 +408,15 @@
         <w:t xml:space="preserve">Machine State: </w:t>
       </w:r>
       <w:r>
-        <w:t xml:space="preserve">Ensure the Isoloader MJ35 </w:t>
+        <w:t xml:space="preserve">Ensure the </w:t>
+      </w:r>
+      <w:proofErr w:type="spellStart"/>
+      <w:r>
+        <w:t>Isoloader</w:t>
+      </w:r>
+      <w:proofErr w:type="spellEnd"/>
+      <w:r>
+        <w:t xml:space="preserve"> MJ35 </w:t>
       </w:r>
       <w:r>
         <w:t>Straddle</w:t>
@@ -507,8 +533,16 @@
     </w:p>
     <w:p>
       <w:pPr>
-        <w:spacing w:before="240"/>
+        <w:pStyle w:val="ListBullet"/>
+        <w:numPr>
+          <w:ilvl w:val="0"/>
+          <w:numId w:val="0"/>
+        </w:numPr>
         <w:jc w:val="center"/>
+        <w:rPr>
+          <w:rFonts w:ascii="Times New Roman" w:hAnsi="Times New Roman"/>
+          <w:color w:val="auto"/>
+        </w:rPr>
       </w:pPr>
       <w:r>
         <w:rPr>
@@ -516,10 +550,10 @@
         </w:rPr>
         <w:lastRenderedPageBreak/>
         <w:drawing>
-          <wp:inline distT="0" distB="0" distL="0" distR="0" wp14:anchorId="4DD5FE7C" wp14:editId="2590BFE7">
-            <wp:extent cx="4572000" cy="4572000"/>
+          <wp:inline distT="0" distB="0" distL="0" distR="0" wp14:anchorId="588FE150" wp14:editId="6566FD67">
+            <wp:extent cx="4899804" cy="4899804"/>
             <wp:effectExtent l="0" t="0" r="0" b="0"/>
-            <wp:docPr id="1" name="Picture 1"/>
+            <wp:docPr id="1177658600" name="Picture 1"/>
             <wp:cNvGraphicFramePr>
               <a:graphicFrameLocks xmlns:a="http://schemas.openxmlformats.org/drawingml/2006/main" noChangeAspect="1"/>
             </wp:cNvGraphicFramePr>
@@ -527,23 +561,36 @@
               <a:graphicData uri="http://schemas.openxmlformats.org/drawingml/2006/picture">
                 <pic:pic xmlns:pic="http://schemas.openxmlformats.org/drawingml/2006/picture">
                   <pic:nvPicPr>
-                    <pic:cNvPr id="0" name="gantry_crane_jacking_point.png"/>
-                    <pic:cNvPicPr/>
+                    <pic:cNvPr id="0" name="Picture 1"/>
+                    <pic:cNvPicPr>
+                      <a:picLocks noChangeAspect="1" noChangeArrowheads="1"/>
+                    </pic:cNvPicPr>
                   </pic:nvPicPr>
                   <pic:blipFill>
-                    <a:blip r:embed="rId6"/>
+                    <a:blip r:embed="rId6">
+                      <a:extLst>
+                        <a:ext uri="{28A0092B-C50C-407E-A947-70E740481C1C}">
+                          <a14:useLocalDpi xmlns:a14="http://schemas.microsoft.com/office/drawing/2010/main" val="0"/>
+                        </a:ext>
+                      </a:extLst>
+                    </a:blip>
+                    <a:srcRect/>
                     <a:stretch>
                       <a:fillRect/>
                     </a:stretch>
                   </pic:blipFill>
-                  <pic:spPr>
+                  <pic:spPr bwMode="auto">
                     <a:xfrm>
                       <a:off x="0" y="0"/>
-                      <a:ext cx="4572000" cy="4572000"/>
+                      <a:ext cx="4910966" cy="4910966"/>
                     </a:xfrm>
                     <a:prstGeom prst="rect">
                       <a:avLst/>
                     </a:prstGeom>
+                    <a:noFill/>
+                    <a:ln>
+                      <a:noFill/>
+                    </a:ln>
                   </pic:spPr>
                 </pic:pic>
               </a:graphicData>
@@ -697,6 +744,7 @@
           <w:color w:val="1B365D"/>
           <w:sz w:val="32"/>
         </w:rPr>
+        <w:lastRenderedPageBreak/>
         <w:t>4. Motor Replacement</w:t>
       </w:r>
     </w:p>
@@ -708,11 +756,22 @@
         <w:rPr>
           <w:b/>
         </w:rPr>
-        <w:lastRenderedPageBreak/>
         <w:t xml:space="preserve">Unmounting: </w:t>
       </w:r>
       <w:r>
-        <w:t>Support the weight of the motor using a crane or hoist. Remove the mounting bolts connecting the motor to the planetary gear hub. Carefully slide the motor out.</w:t>
+        <w:t xml:space="preserve">Support the weight of the motor using a </w:t>
+      </w:r>
+      <w:r>
+        <w:t>folk</w:t>
+      </w:r>
+      <w:r>
+        <w:rPr>
+          <w:lang w:val="vi-VN"/>
+        </w:rPr>
+        <w:t xml:space="preserve"> lift</w:t>
+      </w:r>
+      <w:r>
+        <w:t>. Remove the mounting bolts connecting the motor to the planetary gear hub. Carefully slide the motor out.</w:t>
       </w:r>
     </w:p>
     <w:p>
@@ -898,7 +957,7 @@
               <w:t xml:space="preserve">CAUTION: </w:t>
             </w:r>
             <w:r>
-              <w:t>Ensure that wood chocks are firmly in place under the wheels. Releasing the brakes on a slope without chocks will cause the gantry crane to roll out of control, risking severe injury or machine damage.</w:t>
+              <w:t>Ensure that wood chocks are firmly in place under the wheels. Releasing the brakes on a slope without chocks will cause the crane to roll out of control, risking severe injury or machine damage.</w:t>
             </w:r>
           </w:p>
         </w:tc>
@@ -916,7 +975,7 @@
         <w:t xml:space="preserve">Brake Release Activation: </w:t>
       </w:r>
       <w:r>
-        <w:t>Activate the manual brake release function (chức năng mở thắng) via the software/controller interface to supply hydraulic pressure and open the mechanical brake.</w:t>
+        <w:t>Activate the manual brake release function via the software/controller interface to supply hydraulic pressure and open the mechanical brake.</w:t>
       </w:r>
     </w:p>
     <w:p>
@@ -949,6 +1008,36 @@
     </w:p>
     <w:p>
       <w:pPr>
+        <w:pStyle w:val="ListBullet"/>
+        <w:numPr>
+          <w:ilvl w:val="0"/>
+          <w:numId w:val="0"/>
+        </w:numPr>
+        <w:ind w:left="360" w:hanging="360"/>
+      </w:pPr>
+    </w:p>
+    <w:p>
+      <w:pPr>
+        <w:pStyle w:val="ListBullet"/>
+        <w:numPr>
+          <w:ilvl w:val="0"/>
+          <w:numId w:val="0"/>
+        </w:numPr>
+        <w:ind w:left="360" w:hanging="360"/>
+      </w:pPr>
+    </w:p>
+    <w:p>
+      <w:pPr>
+        <w:pStyle w:val="ListBullet"/>
+        <w:numPr>
+          <w:ilvl w:val="0"/>
+          <w:numId w:val="0"/>
+        </w:numPr>
+        <w:ind w:left="360" w:hanging="360"/>
+      </w:pPr>
+    </w:p>
+    <w:p>
+      <w:pPr>
         <w:spacing w:before="240"/>
       </w:pPr>
       <w:r>
@@ -957,6 +1046,7 @@
           <w:color w:val="1B365D"/>
           <w:sz w:val="32"/>
         </w:rPr>
+        <w:lastRenderedPageBreak/>
         <w:t>7. Reassembly &amp; Lowering</w:t>
       </w:r>
     </w:p>
@@ -971,7 +1061,25 @@
         <w:t xml:space="preserve">Wheel Installation: </w:t>
       </w:r>
       <w:r>
-        <w:t>Lift and position the wheel back onto the hub. Install the wheel nuts and tighten them by hand.</w:t>
+        <w:t>Lift and position the wheel back onto the hub. Install the wheel nuts and tighten them by</w:t>
+      </w:r>
+      <w:r>
+        <w:t xml:space="preserve"> torque w</w:t>
+      </w:r>
+      <w:r>
+        <w:t>r</w:t>
+      </w:r>
+      <w:r>
+        <w:t>ench</w:t>
+      </w:r>
+      <w:r>
+        <w:t>.</w:t>
+      </w:r>
+      <w:r>
+        <w:t xml:space="preserve"> </w:t>
+      </w:r>
+      <w:r>
+        <w:t>Use a torque wrench to tighten the wheel nuts to the specified torque rating in a diagonal star pattern to ensure even load distribution.</w:t>
       </w:r>
     </w:p>
     <w:p>
@@ -982,25 +1090,10 @@
         <w:rPr>
           <w:b/>
         </w:rPr>
-        <w:lastRenderedPageBreak/>
         <w:t xml:space="preserve">Lowering the Jack: </w:t>
       </w:r>
       <w:r>
-        <w:t>Slowly and carefully release the hydraulic pressure on the bottle jack (con đội) to lower the machine until the wheel is resting on the ground. Remove the jack.</w:t>
-      </w:r>
-    </w:p>
-    <w:p>
-      <w:pPr>
-        <w:pStyle w:val="ListBullet"/>
-      </w:pPr>
-      <w:r>
-        <w:rPr>
-          <w:b/>
-        </w:rPr>
-        <w:t xml:space="preserve">Final Torquing: </w:t>
-      </w:r>
-      <w:r>
-        <w:t>Use a torque wrench to tighten the wheel nuts to the specified torque rating in a diagonal star pattern to ensure even load distribution.</w:t>
+        <w:t>Slowly and carefully release the hydraulic pressure on the bottle jack to lower the machine until the wheel is resting on the ground. Remove the jack.</w:t>
       </w:r>
     </w:p>
     <w:p>
@@ -1895,7 +1988,6 @@
   <w:style w:type="character" w:default="1" w:styleId="DefaultParagraphFont">
     <w:name w:val="Default Paragraph Font"/>
     <w:uiPriority w:val="1"/>
-    <w:semiHidden/>
     <w:unhideWhenUsed/>
   </w:style>
   <w:style w:type="table" w:default="1" w:styleId="TableNormal">
@@ -12662,6 +12754,23 @@
         <w:shd w:val="clear" w:color="auto" w:fill="FBCAA2" w:themeFill="accent6" w:themeFillTint="7F"/>
       </w:tcPr>
     </w:tblStylePr>
+  </w:style>
+  <w:style w:type="paragraph" w:styleId="NormalWeb">
+    <w:name w:val="Normal (Web)"/>
+    <w:basedOn w:val="Normal"/>
+    <w:uiPriority w:val="99"/>
+    <w:semiHidden/>
+    <w:unhideWhenUsed/>
+    <w:rsid w:val="00C07ECA"/>
+    <w:pPr>
+      <w:spacing w:before="100" w:beforeAutospacing="1" w:after="100" w:afterAutospacing="1" w:line="240" w:lineRule="auto"/>
+    </w:pPr>
+    <w:rPr>
+      <w:rFonts w:ascii="Times New Roman" w:eastAsia="Times New Roman" w:hAnsi="Times New Roman" w:cs="Times New Roman"/>
+      <w:color w:val="auto"/>
+      <w:sz w:val="24"/>
+      <w:szCs w:val="24"/>
+    </w:rPr>
   </w:style>
 </w:styles>
 </file>

</xml_diff>